<commit_message>
Enhance Messaging Playbook: Add message length guidelines and constraints for clarity and consistency in communication.
</commit_message>
<xml_diff>
--- a/microfrontend/upstander_international/artifacts/p3c_Messaging_Playbook_UpstanderInternational.docx
+++ b/microfrontend/upstander_international/artifacts/p3c_Messaging_Playbook_UpstanderInternational.docx
@@ -619,6 +619,48 @@
                 <w:i w:val="0"/>
                 <w:sz w:val="20"/>
               </w:rPr>
+              <w:t>Message lengths counted</w:t>
+            </w:r>
+          </w:p>
+        </w:tc>
+        <w:tc>
+          <w:tcPr>
+            <w:tcW w:type="dxa" w:w="6480"/>
+          </w:tcPr>
+          <w:p>
+            <w:pPr>
+              <w:spacing w:after="40"/>
+            </w:pPr>
+            <w:r/>
+            <w:r>
+              <w:rPr>
+                <w:rFonts w:ascii="Arial" w:hAnsi="Arial" w:eastAsia="Arial"/>
+                <w:b w:val="0"/>
+                <w:i w:val="0"/>
+                <w:sz w:val="20"/>
+              </w:rPr>
+              <w:t>✓  Message 2: 8 sentences / 208 words / 4 paragraphs — inside the 6–8 sentence, ≤210 word cap. Every message and branch below respects the Message Length table.</w:t>
+            </w:r>
+          </w:p>
+        </w:tc>
+      </w:tr>
+      <w:tr>
+        <w:tc>
+          <w:tcPr>
+            <w:tcW w:type="dxa" w:w="2880"/>
+          </w:tcPr>
+          <w:p>
+            <w:pPr>
+              <w:spacing w:after="40"/>
+            </w:pPr>
+            <w:r/>
+            <w:r>
+              <w:rPr>
+                <w:rFonts w:ascii="Arial" w:hAnsi="Arial" w:eastAsia="Arial"/>
+                <w:b w:val="0"/>
+                <w:i w:val="0"/>
+                <w:sz w:val="20"/>
+              </w:rPr>
               <w:t>Research-transparency confessions</w:t>
             </w:r>
           </w:p>
@@ -1170,7 +1212,31 @@
           <w:i/>
           <w:sz w:val="22"/>
         </w:rPr>
-        <w:t>Sent after he answers Message 1. Contains seven elements, in this order. Confidence is HIGH, so the fee is stated plainly with no softening. Length: 6–8 sentences.</w:t>
+        <w:t>Sent after he answers Message 1. Carries seven elements, in this order. Confidence is HIGH, so the fee is stated plainly with no softening.</w:t>
+      </w:r>
+    </w:p>
+    <w:p>
+      <w:pPr>
+        <w:shd w:val="clear" w:color="auto" w:fill="FFF3CC"/>
+      </w:pPr>
+      <w:r>
+        <w:rPr>
+          <w:rFonts w:ascii="Arial" w:hAnsi="Arial" w:eastAsia="Arial"/>
+          <w:b/>
+          <w:i w:val="0"/>
+          <w:color w:val="1A3A5C"/>
+          <w:sz w:val="22"/>
+        </w:rPr>
+        <w:t xml:space="preserve">📌  SEVEN ELEMENTS, NOT SEVEN PARAGRAPHS.  </w:t>
+      </w:r>
+      <w:r>
+        <w:rPr>
+          <w:rFonts w:ascii="Arial" w:hAnsi="Arial" w:eastAsia="Arial"/>
+          <w:b w:val="0"/>
+          <w:i/>
+          <w:sz w:val="22"/>
+        </w:rPr>
+        <w:t>The list below is a checklist of what must be present — never a paragraph structure. This is a chat DM read in a narrow mobile column, not an email. A 300-word block gets skimmed straight to the price, which means the guarantee, the stakes, and the legitimacy line are all skipped and the fee arrives naked. So the elements are merged: guarantee and "you decide, not me" share a sentence; proof-of-competence and legitimacy share a sentence; price and anchor share a sentence. Hard limits: 6–8 sentences, ≤210 words, ≤45 words in any one sentence, 3–4 short paragraphs. Count them before sending.</w:t>
       </w:r>
     </w:p>
     <w:p>
@@ -1295,6 +1361,411 @@
     </w:p>
     <w:p>
       <w:pPr>
+        <w:spacing w:after="120"/>
+      </w:pPr>
+      <w:r>
+        <w:rPr>
+          <w:rFonts w:ascii="Arial" w:hAnsi="Arial" w:eastAsia="Arial"/>
+          <w:b/>
+          <w:i w:val="0"/>
+          <w:sz w:val="22"/>
+        </w:rPr>
+        <w:t>How the eight elements map onto eight sentences:</w:t>
+      </w:r>
+    </w:p>
+    <w:tbl>
+      <w:tblPr>
+        <w:tblStyle w:val="TableGrid"/>
+        <w:tblW w:type="auto" w:w="0"/>
+        <w:tblLook w:firstColumn="1" w:firstRow="1" w:lastColumn="0" w:lastRow="0" w:noHBand="0" w:noVBand="1" w:val="04A0"/>
+      </w:tblPr>
+      <w:tblGrid>
+        <w:gridCol w:w="4680"/>
+        <w:gridCol w:w="4680"/>
+      </w:tblGrid>
+      <w:tr>
+        <w:tc>
+          <w:tcPr>
+            <w:tcW w:type="dxa" w:w="1296"/>
+          </w:tcPr>
+          <w:p>
+            <w:pPr>
+              <w:spacing w:after="40"/>
+              <w:shd w:val="clear" w:color="auto" w:fill="E8EEF4"/>
+            </w:pPr>
+            <w:r/>
+            <w:r>
+              <w:rPr>
+                <w:rFonts w:ascii="Arial" w:hAnsi="Arial" w:eastAsia="Arial"/>
+                <w:b/>
+                <w:i w:val="0"/>
+                <w:sz w:val="20"/>
+              </w:rPr>
+              <w:t>Sentence</w:t>
+            </w:r>
+          </w:p>
+        </w:tc>
+        <w:tc>
+          <w:tcPr>
+            <w:tcW w:type="dxa" w:w="8064"/>
+          </w:tcPr>
+          <w:p>
+            <w:pPr>
+              <w:spacing w:after="40"/>
+              <w:shd w:val="clear" w:color="auto" w:fill="E8EEF4"/>
+            </w:pPr>
+            <w:r/>
+            <w:r>
+              <w:rPr>
+                <w:rFonts w:ascii="Arial" w:hAnsi="Arial" w:eastAsia="Arial"/>
+                <w:b/>
+                <w:i w:val="0"/>
+                <w:sz w:val="20"/>
+              </w:rPr>
+              <w:t>Elements carried</w:t>
+            </w:r>
+          </w:p>
+        </w:tc>
+      </w:tr>
+      <w:tr>
+        <w:tc>
+          <w:tcPr>
+            <w:tcW w:type="dxa" w:w="1296"/>
+          </w:tcPr>
+          <w:p>
+            <w:pPr>
+              <w:spacing w:after="40"/>
+            </w:pPr>
+            <w:r/>
+            <w:r>
+              <w:rPr>
+                <w:rFonts w:ascii="Arial" w:hAnsi="Arial" w:eastAsia="Arial"/>
+                <w:b w:val="0"/>
+                <w:i w:val="0"/>
+                <w:sz w:val="20"/>
+              </w:rPr>
+              <w:t>1</w:t>
+            </w:r>
+          </w:p>
+        </w:tc>
+        <w:tc>
+          <w:tcPr>
+            <w:tcW w:type="dxa" w:w="8064"/>
+          </w:tcPr>
+          <w:p>
+            <w:pPr>
+              <w:spacing w:after="40"/>
+            </w:pPr>
+            <w:r/>
+            <w:r>
+              <w:rPr>
+                <w:rFonts w:ascii="Arial" w:hAnsi="Arial" w:eastAsia="Arial"/>
+                <w:b w:val="0"/>
+                <w:i w:val="0"/>
+                <w:sz w:val="20"/>
+              </w:rPr>
+              <w:t>Reframe — the 45-minute session, and the three numbers only he has (drawn from Beat 3's confessions)</w:t>
+            </w:r>
+          </w:p>
+        </w:tc>
+      </w:tr>
+      <w:tr>
+        <w:tc>
+          <w:tcPr>
+            <w:tcW w:type="dxa" w:w="1296"/>
+          </w:tcPr>
+          <w:p>
+            <w:pPr>
+              <w:spacing w:after="40"/>
+            </w:pPr>
+            <w:r/>
+            <w:r>
+              <w:rPr>
+                <w:rFonts w:ascii="Arial" w:hAnsi="Arial" w:eastAsia="Arial"/>
+                <w:b w:val="0"/>
+                <w:i w:val="0"/>
+                <w:sz w:val="20"/>
+              </w:rPr>
+              <w:t>2</w:t>
+            </w:r>
+          </w:p>
+        </w:tc>
+        <w:tc>
+          <w:tcPr>
+            <w:tcW w:type="dxa" w:w="8064"/>
+          </w:tcPr>
+          <w:p>
+            <w:pPr>
+              <w:spacing w:after="40"/>
+            </w:pPr>
+            <w:r/>
+            <w:r>
+              <w:rPr>
+                <w:rFonts w:ascii="Arial" w:hAnsi="Arial" w:eastAsia="Arial"/>
+                <w:b w:val="0"/>
+                <w:i w:val="0"/>
+                <w:sz w:val="20"/>
+              </w:rPr>
+              <w:t>Fixed package + staircase acknowledgment + "all you're deciding today"</w:t>
+            </w:r>
+          </w:p>
+        </w:tc>
+      </w:tr>
+      <w:tr>
+        <w:tc>
+          <w:tcPr>
+            <w:tcW w:type="dxa" w:w="1296"/>
+          </w:tcPr>
+          <w:p>
+            <w:pPr>
+              <w:spacing w:after="40"/>
+            </w:pPr>
+            <w:r/>
+            <w:r>
+              <w:rPr>
+                <w:rFonts w:ascii="Arial" w:hAnsi="Arial" w:eastAsia="Arial"/>
+                <w:b w:val="0"/>
+                <w:i w:val="0"/>
+                <w:sz w:val="20"/>
+              </w:rPr>
+              <w:t>3</w:t>
+            </w:r>
+          </w:p>
+        </w:tc>
+        <w:tc>
+          <w:tcPr>
+            <w:tcW w:type="dxa" w:w="8064"/>
+          </w:tcPr>
+          <w:p>
+            <w:pPr>
+              <w:spacing w:after="40"/>
+            </w:pPr>
+            <w:r/>
+            <w:r>
+              <w:rPr>
+                <w:rFonts w:ascii="Arial" w:hAnsi="Arial" w:eastAsia="Arial"/>
+                <w:b w:val="0"/>
+                <w:i w:val="0"/>
+                <w:sz w:val="20"/>
+              </w:rPr>
+              <w:t>The gap, restated in L1 terms</w:t>
+            </w:r>
+          </w:p>
+        </w:tc>
+      </w:tr>
+      <w:tr>
+        <w:tc>
+          <w:tcPr>
+            <w:tcW w:type="dxa" w:w="1296"/>
+          </w:tcPr>
+          <w:p>
+            <w:pPr>
+              <w:spacing w:after="40"/>
+            </w:pPr>
+            <w:r/>
+            <w:r>
+              <w:rPr>
+                <w:rFonts w:ascii="Arial" w:hAnsi="Arial" w:eastAsia="Arial"/>
+                <w:b w:val="0"/>
+                <w:i w:val="0"/>
+                <w:sz w:val="20"/>
+              </w:rPr>
+              <w:t>4</w:t>
+            </w:r>
+          </w:p>
+        </w:tc>
+        <w:tc>
+          <w:tcPr>
+            <w:tcW w:type="dxa" w:w="8064"/>
+          </w:tcPr>
+          <w:p>
+            <w:pPr>
+              <w:spacing w:after="40"/>
+            </w:pPr>
+            <w:r/>
+            <w:r>
+              <w:rPr>
+                <w:rFonts w:ascii="Arial" w:hAnsi="Arial" w:eastAsia="Arial"/>
+                <w:b w:val="0"/>
+                <w:i w:val="0"/>
+                <w:sz w:val="20"/>
+              </w:rPr>
+              <w:t>The stakes number, its exact Beat 4 caveat, and what he has actually collected</w:t>
+            </w:r>
+          </w:p>
+        </w:tc>
+      </w:tr>
+      <w:tr>
+        <w:tc>
+          <w:tcPr>
+            <w:tcW w:type="dxa" w:w="1296"/>
+          </w:tcPr>
+          <w:p>
+            <w:pPr>
+              <w:spacing w:after="40"/>
+            </w:pPr>
+            <w:r/>
+            <w:r>
+              <w:rPr>
+                <w:rFonts w:ascii="Arial" w:hAnsi="Arial" w:eastAsia="Arial"/>
+                <w:b w:val="0"/>
+                <w:i w:val="0"/>
+                <w:sz w:val="20"/>
+              </w:rPr>
+              <w:t>5</w:t>
+            </w:r>
+          </w:p>
+        </w:tc>
+        <w:tc>
+          <w:tcPr>
+            <w:tcW w:type="dxa" w:w="8064"/>
+          </w:tcPr>
+          <w:p>
+            <w:pPr>
+              <w:spacing w:after="40"/>
+            </w:pPr>
+            <w:r/>
+            <w:r>
+              <w:rPr>
+                <w:rFonts w:ascii="Arial" w:hAnsi="Arial" w:eastAsia="Arial"/>
+                <w:b w:val="0"/>
+                <w:i w:val="0"/>
+                <w:sz w:val="20"/>
+              </w:rPr>
+              <w:t>The guarantee + the documented diagnosis he keeps + "you decide that, not me"</w:t>
+            </w:r>
+          </w:p>
+        </w:tc>
+      </w:tr>
+      <w:tr>
+        <w:tc>
+          <w:tcPr>
+            <w:tcW w:type="dxa" w:w="1296"/>
+          </w:tcPr>
+          <w:p>
+            <w:pPr>
+              <w:spacing w:after="40"/>
+            </w:pPr>
+            <w:r/>
+            <w:r>
+              <w:rPr>
+                <w:rFonts w:ascii="Arial" w:hAnsi="Arial" w:eastAsia="Arial"/>
+                <w:b w:val="0"/>
+                <w:i w:val="0"/>
+                <w:sz w:val="20"/>
+              </w:rPr>
+              <w:t>6</w:t>
+            </w:r>
+          </w:p>
+        </w:tc>
+        <w:tc>
+          <w:tcPr>
+            <w:tcW w:type="dxa" w:w="8064"/>
+          </w:tcPr>
+          <w:p>
+            <w:pPr>
+              <w:spacing w:after="40"/>
+            </w:pPr>
+            <w:r/>
+            <w:r>
+              <w:rPr>
+                <w:rFonts w:ascii="Arial" w:hAnsi="Arial" w:eastAsia="Arial"/>
+                <w:b w:val="0"/>
+                <w:i w:val="0"/>
+                <w:sz w:val="20"/>
+              </w:rPr>
+              <w:t>Proof of competence + legitimacy and payment reassurance</w:t>
+            </w:r>
+          </w:p>
+        </w:tc>
+      </w:tr>
+      <w:tr>
+        <w:tc>
+          <w:tcPr>
+            <w:tcW w:type="dxa" w:w="1296"/>
+          </w:tcPr>
+          <w:p>
+            <w:pPr>
+              <w:spacing w:after="40"/>
+            </w:pPr>
+            <w:r/>
+            <w:r>
+              <w:rPr>
+                <w:rFonts w:ascii="Arial" w:hAnsi="Arial" w:eastAsia="Arial"/>
+                <w:b w:val="0"/>
+                <w:i w:val="0"/>
+                <w:sz w:val="20"/>
+              </w:rPr>
+              <w:t>7</w:t>
+            </w:r>
+          </w:p>
+        </w:tc>
+        <w:tc>
+          <w:tcPr>
+            <w:tcW w:type="dxa" w:w="8064"/>
+          </w:tcPr>
+          <w:p>
+            <w:pPr>
+              <w:spacing w:after="40"/>
+            </w:pPr>
+            <w:r/>
+            <w:r>
+              <w:rPr>
+                <w:rFonts w:ascii="Arial" w:hAnsi="Arial" w:eastAsia="Arial"/>
+                <w:b w:val="0"/>
+                <w:i w:val="0"/>
+                <w:sz w:val="20"/>
+              </w:rPr>
+              <w:t>The price, anchored against the stakes</w:t>
+            </w:r>
+          </w:p>
+        </w:tc>
+      </w:tr>
+      <w:tr>
+        <w:tc>
+          <w:tcPr>
+            <w:tcW w:type="dxa" w:w="1296"/>
+          </w:tcPr>
+          <w:p>
+            <w:pPr>
+              <w:spacing w:after="40"/>
+            </w:pPr>
+            <w:r/>
+            <w:r>
+              <w:rPr>
+                <w:rFonts w:ascii="Arial" w:hAnsi="Arial" w:eastAsia="Arial"/>
+                <w:b w:val="0"/>
+                <w:i w:val="0"/>
+                <w:sz w:val="20"/>
+              </w:rPr>
+              <w:t>8</w:t>
+            </w:r>
+          </w:p>
+        </w:tc>
+        <w:tc>
+          <w:tcPr>
+            <w:tcW w:type="dxa" w:w="8064"/>
+          </w:tcPr>
+          <w:p>
+            <w:pPr>
+              <w:spacing w:after="40"/>
+            </w:pPr>
+            <w:r/>
+            <w:r>
+              <w:rPr>
+                <w:rFonts w:ascii="Arial" w:hAnsi="Arial" w:eastAsia="Arial"/>
+                <w:b w:val="0"/>
+                <w:i w:val="0"/>
+                <w:sz w:val="20"/>
+              </w:rPr>
+              <w:t>The ask</w:t>
+            </w:r>
+          </w:p>
+        </w:tc>
+      </w:tr>
+    </w:tbl>
+    <w:p>
+      <w:pPr>
         <w:spacing w:after="160"/>
         <w:ind w:left="120" w:right="120"/>
         <w:shd w:val="clear" w:color="auto" w:fill="EBF3FB"/>
@@ -1306,7 +1777,7 @@
           <w:i w:val="0"/>
           <w:sz w:val="22"/>
         </w:rPr>
-        <w:t>What I'd normally do next is a working session — about 45 minutes — where I walk through everything I've found alongside the numbers only you can provide: whether an email list exists anywhere and how large it is, where your video descriptions actually send people today, and how often this year you've had to hire someone just to make the site work again. You walk away with a documented operational diagnosis you keep, regardless of what comes next.</w:t>
+        <w:t>What I'd normally do next is a 45-minute working session, putting everything I found alongside the three numbers only you have: whether an email list exists, where your videos actually send people, and how often you've paid someone this year to fix the site. It's the first session of a fixed package, and if the diagnosis lands, a working demo and then the build follow — but all you're deciding today is whether it's worth the session fee.</w:t>
       </w:r>
       <w:r>
         <w:br/>
@@ -1329,7 +1800,7 @@
           <w:i w:val="0"/>
           <w:sz w:val="22"/>
         </w:rPr>
-        <w:t>That session is the first step of a fixed package — defined sessions, set deliverables, one price. If the diagnosis lands, the natural next steps are a working demo, then the build itself. All you're deciding today is whether the diagnosis is worth the session fee.</w:t>
+        <w:t>Sixteen of your twenty-five thousand subscribers have bought the course — six hundredths of one percent. Even at one percent, the industry floor for a solo educator and not a number from your business, that base is worth roughly $49,750 in course revenue, against the $3,184 you've collected.</w:t>
       </w:r>
       <w:r>
         <w:br/>
@@ -1352,7 +1823,7 @@
           <w:i w:val="0"/>
           <w:sz w:val="22"/>
         </w:rPr>
-        <w:t>Here's why I think it is. Twenty-five thousand people chose to subscribe to you. Sixteen have bought the course — six hundredths of one percent, and $3,184 collected. Even at one percent, which is the industry floor for a solo educator and not a number from your business, that same subscriber base is worth roughly $49,750 in course revenue. The session pins the real figure down with your numbers, not my assumptions.</w:t>
+        <w:t>If you don't walk away with something worth more than the fee, you don't pay, and the documented diagnosis is yours to keep either way — you decide that, not me. That's the kind of operational problem we build systems to close, and Dev8X is a registered studio, so payment runs through a proper invoice, not a personal transfer.</w:t>
       </w:r>
       <w:r>
         <w:br/>
@@ -1375,99 +1846,21 @@
           <w:i w:val="0"/>
           <w:sz w:val="22"/>
         </w:rPr>
-        <w:t>If you don't walk away with something worth more than the fee, you don't pay. You decide, not me. And the documented diagnosis is yours to keep either way.</w:t>
+        <w:t>The session is [CONSULTATION_FEE], against $49,750 you're not collecting right now. Reply to confirm and I'll send over a couple of time options.</w:t>
       </w:r>
-      <w:r>
-        <w:br/>
-      </w:r>
+    </w:p>
+    <w:p>
+      <w:pPr>
+        <w:spacing w:after="120"/>
+      </w:pPr>
       <w:r>
         <w:rPr>
           <w:rFonts w:ascii="Arial" w:hAnsi="Arial" w:eastAsia="Arial"/>
           <w:b w:val="0"/>
-          <w:i w:val="0"/>
+          <w:i/>
           <w:sz w:val="22"/>
         </w:rPr>
-      </w:r>
-      <w:r>
-        <w:br/>
-      </w:r>
-      <w:r>
-        <w:rPr>
-          <w:rFonts w:ascii="Arial" w:hAnsi="Arial" w:eastAsia="Arial"/>
-          <w:b w:val="0"/>
-          <w:i w:val="0"/>
-          <w:sz w:val="22"/>
-        </w:rPr>
-        <w:t>This is the kind of operational problem we build systems to close.</w:t>
-      </w:r>
-      <w:r>
-        <w:br/>
-      </w:r>
-      <w:r>
-        <w:rPr>
-          <w:rFonts w:ascii="Arial" w:hAnsi="Arial" w:eastAsia="Arial"/>
-          <w:b w:val="0"/>
-          <w:i w:val="0"/>
-          <w:sz w:val="22"/>
-        </w:rPr>
-      </w:r>
-      <w:r>
-        <w:br/>
-      </w:r>
-      <w:r>
-        <w:rPr>
-          <w:rFonts w:ascii="Arial" w:hAnsi="Arial" w:eastAsia="Arial"/>
-          <w:b w:val="0"/>
-          <w:i w:val="0"/>
-          <w:sz w:val="22"/>
-        </w:rPr>
-        <w:t>Dev8X is a registered studio — payment runs through a proper invoice, not a personal transfer.</w:t>
-      </w:r>
-      <w:r>
-        <w:br/>
-      </w:r>
-      <w:r>
-        <w:rPr>
-          <w:rFonts w:ascii="Arial" w:hAnsi="Arial" w:eastAsia="Arial"/>
-          <w:b w:val="0"/>
-          <w:i w:val="0"/>
-          <w:sz w:val="22"/>
-        </w:rPr>
-      </w:r>
-      <w:r>
-        <w:br/>
-      </w:r>
-      <w:r>
-        <w:rPr>
-          <w:rFonts w:ascii="Arial" w:hAnsi="Arial" w:eastAsia="Arial"/>
-          <w:b w:val="0"/>
-          <w:i w:val="0"/>
-          <w:sz w:val="22"/>
-        </w:rPr>
-        <w:t>The session is [CONSULTATION_FEE]. Against $49,750 in course revenue you're not collecting right now, it's a small investment to know exactly where you stand.</w:t>
-      </w:r>
-      <w:r>
-        <w:br/>
-      </w:r>
-      <w:r>
-        <w:rPr>
-          <w:rFonts w:ascii="Arial" w:hAnsi="Arial" w:eastAsia="Arial"/>
-          <w:b w:val="0"/>
-          <w:i w:val="0"/>
-          <w:sz w:val="22"/>
-        </w:rPr>
-      </w:r>
-      <w:r>
-        <w:br/>
-      </w:r>
-      <w:r>
-        <w:rPr>
-          <w:rFonts w:ascii="Arial" w:hAnsi="Arial" w:eastAsia="Arial"/>
-          <w:b w:val="0"/>
-          <w:i w:val="0"/>
-          <w:sz w:val="22"/>
-        </w:rPr>
-        <w:t>If that sounds right, reply to confirm and I'll send over a couple of time options.</w:t>
+        <w:t>8 sentences · 208 words · 4 paragraphs. Every element above is present. Nothing was dropped to reach this length — the cut material was repetition: the reframe already establishes that the session runs on the numbers only he has, so a later "the session pins the exact figure down" earns nothing.</w:t>
       </w:r>
     </w:p>
     <w:p>
@@ -1512,7 +1905,7 @@
           <w:i w:val="0"/>
           <w:sz w:val="22"/>
         </w:rPr>
-        <w:t>No pressure at all — just circling back. The checkout 404 isn't going anywhere, and $49,750 was the conservative read, not the optimistic one. The guarantee still stands: if the session isn't worth more than the fee, you don't pay. Either way, happy to leave it here if the timing's off — just let me know.</w:t>
+        <w:t>No pressure at all — just circling back. The checkout 404 isn't going anywhere, and $49,750 was the conservative read, not the optimistic one. The guarantee still stands — if the session isn't worth more than the fee, you don't pay — and if the timing's off, happy to leave it here.</w:t>
       </w:r>
     </w:p>
     <w:p>
@@ -1894,7 +2287,7 @@
           <w:i w:val="0"/>
           <w:sz w:val="22"/>
         </w:rPr>
-        <w:t>[Absorb the specific correction: "So the R.E.A.Ch! checkout is actually fixed" / "so the subscriber number reads differently than I framed it" — noted.] That changes [the picture / the stakes estimate / which problem to prioritise], and I'd rather recalibrate than defend a number.</w:t>
+        <w:t>[Absorb the specific correction — noted.] That changes [the stakes estimate / which problem to prioritise], and I'd rather recalibrate than defend a number.</w:t>
       </w:r>
       <w:r>
         <w:br/>
@@ -1917,30 +2310,7 @@
           <w:i w:val="0"/>
           <w:sz w:val="22"/>
         </w:rPr>
-        <w:t>That's exactly why doing this properly matters. From outside, I'll always have blind spots. The session is where my guesses get replaced with your real numbers — and a correction like that is the most useful thing you could have said.</w:t>
-      </w:r>
-      <w:r>
-        <w:br/>
-      </w:r>
-      <w:r>
-        <w:rPr>
-          <w:rFonts w:ascii="Arial" w:hAnsi="Arial" w:eastAsia="Arial"/>
-          <w:b w:val="0"/>
-          <w:i w:val="0"/>
-          <w:sz w:val="22"/>
-        </w:rPr>
-      </w:r>
-      <w:r>
-        <w:br/>
-      </w:r>
-      <w:r>
-        <w:rPr>
-          <w:rFonts w:ascii="Arial" w:hAnsi="Arial" w:eastAsia="Arial"/>
-          <w:b w:val="0"/>
-          <w:i w:val="0"/>
-          <w:sz w:val="22"/>
-        </w:rPr>
-        <w:t>Which of the four do you think is closest to the actual problem?</w:t>
+        <w:t>From outside I'll always have blind spots, which is exactly why the session exists — it's where my guesses get replaced with your real numbers. Which of the four do you think is closest to the actual problem?</w:t>
       </w:r>
     </w:p>
     <w:p>
@@ -2100,7 +2470,7 @@
           <w:i w:val="0"/>
           <w:sz w:val="22"/>
         </w:rPr>
-        <w:t>Then I got the sharpest one wrong, and I'd rather know that now than pitch you on it. Thank you for actually checking.</w:t>
+        <w:t>Then I got the sharpest one wrong, and I'd rather know that now than pitch you on it — thank you for actually checking.</w:t>
       </w:r>
       <w:r>
         <w:br/>
@@ -2123,30 +2493,7 @@
           <w:i w:val="0"/>
           <w:sz w:val="22"/>
         </w:rPr>
-        <w:t>If it's working today, either it was fixed recently or it fails only on some paths — worth knowing which, but that's your call, not mine to guess at.</w:t>
-      </w:r>
-      <w:r>
-        <w:br/>
-      </w:r>
-      <w:r>
-        <w:rPr>
-          <w:rFonts w:ascii="Arial" w:hAnsi="Arial" w:eastAsia="Arial"/>
-          <w:b w:val="0"/>
-          <w:i w:val="0"/>
-          <w:sz w:val="22"/>
-        </w:rPr>
-      </w:r>
-      <w:r>
-        <w:br/>
-      </w:r>
-      <w:r>
-        <w:rPr>
-          <w:rFonts w:ascii="Arial" w:hAnsi="Arial" w:eastAsia="Arial"/>
-          <w:b w:val="0"/>
-          <w:i w:val="0"/>
-          <w:sz w:val="22"/>
-        </w:rPr>
-        <w:t>The other three doors are still shut, and they're the quieter ones: fifty pages with no opt-in form anywhere, course pages with no modules or preview, and a contact page with no inquiry form. Sixteen enrolled against twenty-five thousand subscribers doesn't get explained by a checkout that works.</w:t>
+        <w:t>The other three doors are still shut, and they're the quieter ones: fifty pages with no opt-in form, course pages with no modules, a contact page with no inquiry form. Sixteen enrolled against twenty-five thousand subscribers doesn't get explained by a checkout that works.</w:t>
       </w:r>
       <w:r>
         <w:br/>
@@ -2193,7 +2540,7 @@
           <w:i/>
           <w:sz w:val="22"/>
         </w:rPr>
-        <w:t>Note what this response does: it forfeits the loudest claim and keeps the argument, because the 16-of-25,000 gap was never dependent on the 404 alone. Then it hands him the Message 1 question, so a refutation lands him exactly where a reply would have. If he verified the 404 and it FAILED for him, he will usually say so unprompted — treat that as the strongest possible reply and go straight to Message 1. Also: if he reports the checkout works, strike the "checkout 404 isn't going anywhere" line from Message 3 and Branch B before sending either.</w:t>
+        <w:t>Note what this response does: it forfeits the loudest claim and keeps the argument, because the 16-of-25,000 gap never depended on the 404 alone. Then it hands him the Message 1 question, so a refutation lands him exactly where a reply would have. Do NOT speculate in the message about why it works now ("maybe it was fixed recently, maybe it fails on some paths") — that is you guessing at his systems again, moments after being wrong. If he raises it, follow his lead. If he verified the 404 and it FAILED for him, he will usually say so unprompted: treat that as the strongest possible reply and go straight to Message 1. And if he reports the checkout works, strike the "checkout 404 isn't going anywhere" line from Message 3 and Branch B before sending either.</w:t>
       </w:r>
     </w:p>
     <w:p>
@@ -3168,7 +3515,7 @@
           <w:i w:val="0"/>
           <w:sz w:val="22"/>
         </w:rPr>
-        <w:t>I run Dev8X — a small development studio that builds web platforms and automation systems, mostly for businesses in the speaking and education space.</w:t>
+        <w:t>I run Dev8X — a small development studio building web platforms and automation systems, mostly for businesses in the speaking and education space.</w:t>
       </w:r>
       <w:r>
         <w:br/>
@@ -3191,7 +3538,7 @@
           <w:i w:val="0"/>
           <w:sz w:val="22"/>
         </w:rPr>
-        <w:t>I looked at UPstander International because I came across your work and then your YouTube channel. Twenty-five thousand subscribers with a new video most days is a serious audience engine, and I got curious about whether the course checkout could actually capture it. The video is what I found when I looked.</w:t>
+        <w:t>I looked at UPstander International because I came across your YouTube channel: twenty-five thousand subscribers with a new video most days is a serious audience engine, and I got curious whether the course checkout could capture it. The video is what I found.</w:t>
       </w:r>
       <w:r>
         <w:br/>
@@ -3214,7 +3561,7 @@
           <w:i w:val="0"/>
           <w:sz w:val="22"/>
         </w:rPr>
-        <w:t>I don't do mass outreach. I research one business at a time and only reach out if I find something worth flagging.</w:t>
+        <w:t>I don't do mass outreach — I research one business at a time, and only reach out if I find something worth flagging.</w:t>
       </w:r>
     </w:p>
     <w:p>
@@ -4122,6 +4469,360 @@
           <w:color w:val="2A7AAA"/>
           <w:sz w:val="36"/>
         </w:rPr>
+        <w:t>Message Length Limits</w:t>
+      </w:r>
+    </w:p>
+    <w:p>
+      <w:pPr>
+        <w:spacing w:after="120"/>
+      </w:pPr>
+      <w:r>
+        <w:rPr>
+          <w:rFonts w:ascii="Arial" w:hAnsi="Arial" w:eastAsia="Arial"/>
+          <w:b w:val="0"/>
+          <w:i/>
+          <w:sz w:val="22"/>
+        </w:rPr>
+        <w:t>These are read on a phone, in a thread, between meetings. Length is not thoroughness — in a DM it is friction. If an element will not fit, merge it into an adjacent sentence; never add a paragraph.</w:t>
+      </w:r>
+    </w:p>
+    <w:tbl>
+      <w:tblPr>
+        <w:tblStyle w:val="TableGrid"/>
+        <w:tblW w:type="auto" w:w="0"/>
+        <w:tblLook w:firstColumn="1" w:firstRow="1" w:lastColumn="0" w:lastRow="0" w:noHBand="0" w:noVBand="1" w:val="04A0"/>
+      </w:tblPr>
+      <w:tblGrid>
+        <w:gridCol w:w="3120"/>
+        <w:gridCol w:w="3120"/>
+        <w:gridCol w:w="3120"/>
+      </w:tblGrid>
+      <w:tr>
+        <w:tc>
+          <w:tcPr>
+            <w:tcW w:type="dxa" w:w="4464"/>
+          </w:tcPr>
+          <w:p>
+            <w:pPr>
+              <w:spacing w:after="40"/>
+              <w:shd w:val="clear" w:color="auto" w:fill="E8EEF4"/>
+            </w:pPr>
+            <w:r/>
+            <w:r>
+              <w:rPr>
+                <w:rFonts w:ascii="Arial" w:hAnsi="Arial" w:eastAsia="Arial"/>
+                <w:b/>
+                <w:i w:val="0"/>
+                <w:sz w:val="20"/>
+              </w:rPr>
+              <w:t>Message</w:t>
+            </w:r>
+          </w:p>
+        </w:tc>
+        <w:tc>
+          <w:tcPr>
+            <w:tcW w:type="dxa" w:w="2448"/>
+          </w:tcPr>
+          <w:p>
+            <w:pPr>
+              <w:spacing w:after="40"/>
+              <w:shd w:val="clear" w:color="auto" w:fill="E8EEF4"/>
+            </w:pPr>
+            <w:r/>
+            <w:r>
+              <w:rPr>
+                <w:rFonts w:ascii="Arial" w:hAnsi="Arial" w:eastAsia="Arial"/>
+                <w:b/>
+                <w:i w:val="0"/>
+                <w:sz w:val="20"/>
+              </w:rPr>
+              <w:t>Sentences</w:t>
+            </w:r>
+          </w:p>
+        </w:tc>
+        <w:tc>
+          <w:tcPr>
+            <w:tcW w:type="dxa" w:w="2448"/>
+          </w:tcPr>
+          <w:p>
+            <w:pPr>
+              <w:spacing w:after="40"/>
+              <w:shd w:val="clear" w:color="auto" w:fill="E8EEF4"/>
+            </w:pPr>
+            <w:r/>
+            <w:r>
+              <w:rPr>
+                <w:rFonts w:ascii="Arial" w:hAnsi="Arial" w:eastAsia="Arial"/>
+                <w:b/>
+                <w:i w:val="0"/>
+                <w:sz w:val="20"/>
+              </w:rPr>
+              <w:t>Words</w:t>
+            </w:r>
+          </w:p>
+        </w:tc>
+      </w:tr>
+      <w:tr>
+        <w:tc>
+          <w:tcPr>
+            <w:tcW w:type="dxa" w:w="4464"/>
+          </w:tcPr>
+          <w:p>
+            <w:pPr>
+              <w:spacing w:after="40"/>
+            </w:pPr>
+            <w:r/>
+            <w:r>
+              <w:rPr>
+                <w:rFonts w:ascii="Arial" w:hAnsi="Arial" w:eastAsia="Arial"/>
+                <w:b w:val="0"/>
+                <w:i w:val="0"/>
+                <w:sz w:val="20"/>
+              </w:rPr>
+              <w:t>Message 1</w:t>
+            </w:r>
+          </w:p>
+        </w:tc>
+        <w:tc>
+          <w:tcPr>
+            <w:tcW w:type="dxa" w:w="2448"/>
+          </w:tcPr>
+          <w:p>
+            <w:pPr>
+              <w:spacing w:after="40"/>
+            </w:pPr>
+            <w:r/>
+            <w:r>
+              <w:rPr>
+                <w:rFonts w:ascii="Arial" w:hAnsi="Arial" w:eastAsia="Arial"/>
+                <w:b w:val="0"/>
+                <w:i w:val="0"/>
+                <w:sz w:val="20"/>
+              </w:rPr>
+              <w:t>2–3</w:t>
+            </w:r>
+          </w:p>
+        </w:tc>
+        <w:tc>
+          <w:tcPr>
+            <w:tcW w:type="dxa" w:w="2448"/>
+          </w:tcPr>
+          <w:p>
+            <w:pPr>
+              <w:spacing w:after="40"/>
+            </w:pPr>
+            <w:r/>
+            <w:r>
+              <w:rPr>
+                <w:rFonts w:ascii="Arial" w:hAnsi="Arial" w:eastAsia="Arial"/>
+                <w:b w:val="0"/>
+                <w:i w:val="0"/>
+                <w:sz w:val="20"/>
+              </w:rPr>
+              <w:t>≤ 65</w:t>
+            </w:r>
+          </w:p>
+        </w:tc>
+      </w:tr>
+      <w:tr>
+        <w:tc>
+          <w:tcPr>
+            <w:tcW w:type="dxa" w:w="4464"/>
+          </w:tcPr>
+          <w:p>
+            <w:pPr>
+              <w:spacing w:after="40"/>
+            </w:pPr>
+            <w:r/>
+            <w:r>
+              <w:rPr>
+                <w:rFonts w:ascii="Arial" w:hAnsi="Arial" w:eastAsia="Arial"/>
+                <w:b w:val="0"/>
+                <w:i w:val="0"/>
+                <w:sz w:val="20"/>
+              </w:rPr>
+              <w:t>Message 2 — consultation offer</w:t>
+            </w:r>
+          </w:p>
+        </w:tc>
+        <w:tc>
+          <w:tcPr>
+            <w:tcW w:type="dxa" w:w="2448"/>
+          </w:tcPr>
+          <w:p>
+            <w:pPr>
+              <w:spacing w:after="40"/>
+            </w:pPr>
+            <w:r/>
+            <w:r>
+              <w:rPr>
+                <w:rFonts w:ascii="Arial" w:hAnsi="Arial" w:eastAsia="Arial"/>
+                <w:b w:val="0"/>
+                <w:i w:val="0"/>
+                <w:sz w:val="20"/>
+              </w:rPr>
+              <w:t>6–8</w:t>
+            </w:r>
+          </w:p>
+        </w:tc>
+        <w:tc>
+          <w:tcPr>
+            <w:tcW w:type="dxa" w:w="2448"/>
+          </w:tcPr>
+          <w:p>
+            <w:pPr>
+              <w:spacing w:after="40"/>
+            </w:pPr>
+            <w:r/>
+            <w:r>
+              <w:rPr>
+                <w:rFonts w:ascii="Arial" w:hAnsi="Arial" w:eastAsia="Arial"/>
+                <w:b w:val="0"/>
+                <w:i w:val="0"/>
+                <w:sz w:val="20"/>
+              </w:rPr>
+              <w:t>≤ 210</w:t>
+            </w:r>
+          </w:p>
+        </w:tc>
+      </w:tr>
+      <w:tr>
+        <w:tc>
+          <w:tcPr>
+            <w:tcW w:type="dxa" w:w="4464"/>
+          </w:tcPr>
+          <w:p>
+            <w:pPr>
+              <w:spacing w:after="40"/>
+            </w:pPr>
+            <w:r/>
+            <w:r>
+              <w:rPr>
+                <w:rFonts w:ascii="Arial" w:hAnsi="Arial" w:eastAsia="Arial"/>
+                <w:b w:val="0"/>
+                <w:i w:val="0"/>
+                <w:sz w:val="20"/>
+              </w:rPr>
+              <w:t>Message 3</w:t>
+            </w:r>
+          </w:p>
+        </w:tc>
+        <w:tc>
+          <w:tcPr>
+            <w:tcW w:type="dxa" w:w="2448"/>
+          </w:tcPr>
+          <w:p>
+            <w:pPr>
+              <w:spacing w:after="40"/>
+            </w:pPr>
+            <w:r/>
+            <w:r>
+              <w:rPr>
+                <w:rFonts w:ascii="Arial" w:hAnsi="Arial" w:eastAsia="Arial"/>
+                <w:b w:val="0"/>
+                <w:i w:val="0"/>
+                <w:sz w:val="20"/>
+              </w:rPr>
+              <w:t>2–3</w:t>
+            </w:r>
+          </w:p>
+        </w:tc>
+        <w:tc>
+          <w:tcPr>
+            <w:tcW w:type="dxa" w:w="2448"/>
+          </w:tcPr>
+          <w:p>
+            <w:pPr>
+              <w:spacing w:after="40"/>
+            </w:pPr>
+            <w:r/>
+            <w:r>
+              <w:rPr>
+                <w:rFonts w:ascii="Arial" w:hAnsi="Arial" w:eastAsia="Arial"/>
+                <w:b w:val="0"/>
+                <w:i w:val="0"/>
+                <w:sz w:val="20"/>
+              </w:rPr>
+              <w:t>≤ 60</w:t>
+            </w:r>
+          </w:p>
+        </w:tc>
+      </w:tr>
+      <w:tr>
+        <w:tc>
+          <w:tcPr>
+            <w:tcW w:type="dxa" w:w="4464"/>
+          </w:tcPr>
+          <w:p>
+            <w:pPr>
+              <w:spacing w:after="40"/>
+            </w:pPr>
+            <w:r/>
+            <w:r>
+              <w:rPr>
+                <w:rFonts w:ascii="Arial" w:hAnsi="Arial" w:eastAsia="Arial"/>
+                <w:b w:val="0"/>
+                <w:i w:val="0"/>
+                <w:sz w:val="20"/>
+              </w:rPr>
+              <w:t>Every war-game branch reply</w:t>
+            </w:r>
+          </w:p>
+        </w:tc>
+        <w:tc>
+          <w:tcPr>
+            <w:tcW w:type="dxa" w:w="2448"/>
+          </w:tcPr>
+          <w:p>
+            <w:pPr>
+              <w:spacing w:after="40"/>
+            </w:pPr>
+            <w:r/>
+            <w:r>
+              <w:rPr>
+                <w:rFonts w:ascii="Arial" w:hAnsi="Arial" w:eastAsia="Arial"/>
+                <w:b w:val="0"/>
+                <w:i w:val="0"/>
+                <w:sz w:val="20"/>
+              </w:rPr>
+              <w:t>2–5</w:t>
+            </w:r>
+          </w:p>
+        </w:tc>
+        <w:tc>
+          <w:tcPr>
+            <w:tcW w:type="dxa" w:w="2448"/>
+          </w:tcPr>
+          <w:p>
+            <w:pPr>
+              <w:spacing w:after="40"/>
+            </w:pPr>
+            <w:r/>
+            <w:r>
+              <w:rPr>
+                <w:rFonts w:ascii="Arial" w:hAnsi="Arial" w:eastAsia="Arial"/>
+                <w:b w:val="0"/>
+                <w:i w:val="0"/>
+                <w:sz w:val="20"/>
+              </w:rPr>
+              <w:t>≤ 90</w:t>
+            </w:r>
+          </w:p>
+        </w:tc>
+      </w:tr>
+    </w:tbl>
+    <w:p>
+      <w:pPr>
+        <w:spacing w:before="240" w:after="80"/>
+      </w:pPr>
+      <w:r>
+        <w:rPr>
+          <w:rFonts w:ascii="Arial" w:hAnsi="Arial" w:eastAsia="Arial"/>
+          <w:b/>
+          <w:i w:val="0"/>
+          <w:color w:val="2A7AAA"/>
+          <w:sz w:val="36"/>
+        </w:rPr>
         <w:t>Exit Criteria</w:t>
       </w:r>
     </w:p>

</xml_diff>